<commit_message>
feat: Shopping System Two Modifications
Co-authored-by: traeagent <traeagent@users.noreply.github.com>
</commit_message>
<xml_diff>
--- a/零号藏馆商城系统-毕业论文.docx
+++ b/零号藏馆商城系统-毕业论文.docx
@@ -12499,11 +12499,9 @@
         <w:rPr>
           <w:rFonts w:hint="eastAsia"/>
         </w:rPr>
-        <w:t>2</w:t>
-      </w:r>
-      <w:r>
-        <w:t>）订单管理：查看平台全部交易订单，查看订单交易信息与明细，可对待发货订单进行发货操作，可对已发货订单进行强制完成操作，也可以删除订单记录。</w:t>
-      </w:r>
+        <w:t>2）订单管理：查看平台全部交易订单，查看订单交易信息与明细，可对待发货订单进行发货操作，可对已发货订单进行强制完成操作。</w:t>
+      </w:r>
+      <w:r/>
     </w:p>
     <w:p>
       <w:pPr>
@@ -12513,17 +12511,11 @@
         <w:rPr>
           <w:rFonts w:hint="eastAsia"/>
         </w:rPr>
-        <w:t>3</w:t>
-      </w:r>
-      <w:r>
-        <w:t>）用户管理：查看所有注册用户信息，可修改用户角色（普通用户</w:t>
-      </w:r>
-      <w:r>
-        <w:t>/</w:t>
-      </w:r>
-      <w:r>
-        <w:t>管理员），可启用或禁用用户账号，可重置用户密码，管控平台用户群体。</w:t>
-      </w:r>
+        <w:t>3）用户管理：查看所有注册用户信息，可启用或禁用用户账号，可重置用户密码（仅限普通用户），管控平台用户群体。</w:t>
+      </w:r>
+      <w:r/>
+      <w:r/>
+      <w:r/>
     </w:p>
     <w:p>
       <w:pPr>
@@ -27753,19 +27745,17 @@
         <w:rPr>
           <w:rFonts w:hint="eastAsia"/>
         </w:rPr>
-        <w:t>（</w:t>
-      </w:r>
-      <w:r>
-        <w:rPr>
-          <w:rFonts w:hint="eastAsia"/>
-        </w:rPr>
-        <w:t>2</w:t>
-      </w:r>
-      <w:r>
-        <w:rPr>
-          <w:rFonts w:hint="eastAsia"/>
-        </w:rPr>
-        <w:t>）用户管理：管理员可以通过用户名或邮箱搜索用户，支持分页浏览。管理员可以执行禁用或启用用户账号的操作。系统设计为固定一个管理员和多个普通用户的模式，因此不提供角色切换和重置密码功能。</w:t>
+        <w:t>（2）用户管理：管理员可以通过用户名或邮箱搜索用户，支持分页浏览。管理员可以执行禁用或启用用户账号的操作。系统设计为固定一个管理员和多个普通用户的模式，因此不提供角色切换功能；重置密码和启用/禁用功能仅对普通用户生效。</w:t>
+      </w:r>
+      <w:r>
+        <w:rPr>
+          <w:rFonts w:hint="eastAsia"/>
+        </w:rPr>
+      </w:r>
+      <w:r>
+        <w:rPr>
+          <w:rFonts w:hint="eastAsia"/>
+        </w:rPr>
       </w:r>
     </w:p>
     <w:p>
@@ -29439,20 +29429,12 @@
         <w:ind w:firstLine="480"/>
       </w:pPr>
       <w:r>
-        <w:t>用户管理页面展示平台所有注册用户信息，包含用户</w:t>
-      </w:r>
-      <w:r>
-        <w:t>ID</w:t>
-      </w:r>
-      <w:r>
-        <w:t>、用户名、邮箱、手机号、角色、状态等核心数据，管理员可实时监控平台用户注册情况。管理员可修改用户角色（普通用户</w:t>
-      </w:r>
-      <w:r>
-        <w:t>/</w:t>
-      </w:r>
-      <w:r>
-        <w:t>管理员），可启用或禁用用户账号，可重置用户密码。</w:t>
-      </w:r>
+        <w:t>用户管理页面展示平台所有注册用户信息，包含用户ID、用户名、邮箱、手机号、角色、状态等核心数据，管理员可实时监控平台用户注册情况。管理员可启用或禁用用户账号，可重置用户密码（仅限普通用户）。</w:t>
+      </w:r>
+      <w:r/>
+      <w:r/>
+      <w:r/>
+      <w:r/>
     </w:p>
     <w:p>
       <w:pPr>
@@ -29462,53 +29444,9 @@
         <w:rPr>
           <w:noProof/>
         </w:rPr>
-        <w:drawing>
-          <wp:anchor distT="0" distB="0" distL="114300" distR="114300" simplePos="0" relativeHeight="251725824" behindDoc="0" locked="0" layoutInCell="1" allowOverlap="1" wp14:anchorId="41DC00E9" wp14:editId="3E5B3D85">
-            <wp:simplePos x="0" y="0"/>
-            <wp:positionH relativeFrom="column">
-              <wp:posOffset>207010</wp:posOffset>
-            </wp:positionH>
-            <wp:positionV relativeFrom="paragraph">
-              <wp:posOffset>716915</wp:posOffset>
-            </wp:positionV>
-            <wp:extent cx="5760085" cy="1720215"/>
-            <wp:effectExtent l="0" t="0" r="0" b="0"/>
-            <wp:wrapTopAndBottom/>
-            <wp:docPr id="632767042" name="图片 1"/>
-            <wp:cNvGraphicFramePr>
-              <a:graphicFrameLocks xmlns:a="http://schemas.openxmlformats.org/drawingml/2006/main" noChangeAspect="1"/>
-            </wp:cNvGraphicFramePr>
-            <a:graphic xmlns:a="http://schemas.openxmlformats.org/drawingml/2006/main">
-              <a:graphicData uri="http://schemas.openxmlformats.org/drawingml/2006/picture">
-                <pic:pic xmlns:pic="http://schemas.openxmlformats.org/drawingml/2006/picture">
-                  <pic:nvPicPr>
-                    <pic:cNvPr id="632767042" name=""/>
-                    <pic:cNvPicPr/>
-                  </pic:nvPicPr>
-                  <pic:blipFill>
-                    <a:blip r:embed="rId43"/>
-                    <a:stretch>
-                      <a:fillRect/>
-                    </a:stretch>
-                  </pic:blipFill>
-                  <pic:spPr>
-                    <a:xfrm>
-                      <a:off x="0" y="0"/>
-                      <a:ext cx="5760085" cy="1720215"/>
-                    </a:xfrm>
-                    <a:prstGeom prst="rect">
-                      <a:avLst/>
-                    </a:prstGeom>
-                  </pic:spPr>
-                </pic:pic>
-              </a:graphicData>
-            </a:graphic>
-          </wp:anchor>
-        </w:drawing>
-      </w:r>
-      <w:r>
-        <w:t>被禁用的用户无法登录系统，保障平台安全。密码重置功能将用户密码重置为默认密码，用户登录后可自行修改。所有用户管理操作均记录操作日志，便于追溯。</w:t>
-      </w:r>
+        <w:t>被禁用的用户无法登录系统，保障平台安全。密码重置功能将用户密码重置为默认密码，用户登录后可自行修改。</w:t>
+      </w:r>
+      <w:r/>
     </w:p>
     <w:p>
       <w:pPr>
@@ -31116,7 +31054,7 @@
                 <w:sz w:val="21"/>
                 <w:szCs w:val="21"/>
               </w:rPr>
-              <w:t>提示用户不存在</w:t>
+              <w:t>提示用户名或密码错误</w:t>
             </w:r>
           </w:p>
         </w:tc>
@@ -36565,44 +36503,20 @@
         <w:ind w:firstLine="480"/>
       </w:pPr>
       <w:r>
-        <w:t>本次系统测试采用单元测试、</w:t>
-      </w:r>
-      <w:r>
-        <w:t>API</w:t>
-      </w:r>
-      <w:r>
-        <w:t>集成测试与黑盒功能测试相结合的方式开展，覆盖了前台用户端与管理员后台的全部核心业务模块，共设计并执行测试用例</w:t>
-      </w:r>
-      <w:r>
-        <w:t>88</w:t>
-      </w:r>
-      <w:r>
-        <w:t>个（含</w:t>
-      </w:r>
-      <w:r>
-        <w:t>51</w:t>
-      </w:r>
-      <w:r>
-        <w:t>个单元测试和</w:t>
-      </w:r>
-      <w:r>
-        <w:t>37</w:t>
-      </w:r>
-      <w:r>
-        <w:t>个</w:t>
-      </w:r>
-      <w:r>
-        <w:t>API</w:t>
-      </w:r>
-      <w:r>
-        <w:t>集成测试），以及</w:t>
-      </w:r>
-      <w:r>
-        <w:t>25</w:t>
-      </w:r>
-      <w:r>
-        <w:t>个黑盒功能测试用例，包含正常业务流程、异常输入校验、权限控制、接口逻辑、数据一致性等多维度验证。</w:t>
-      </w:r>
+        <w:t>本次系统测试采用单元测试、API集成测试与黑盒功能测试相结合的方式开展，覆盖了前台用户端与管理员后台的全部核心业务模块，共设计并执行测试用例113个，其中单元测试51个、API集成测试37个、黑盒功能测试25个，包含正常业务流程、异常输入校验、权限控制、接口逻辑、数据一致性等多维度验证。</w:t>
+      </w:r>
+      <w:r/>
+      <w:r/>
+      <w:r/>
+      <w:r/>
+      <w:r/>
+      <w:r/>
+      <w:r/>
+      <w:r/>
+      <w:r/>
+      <w:r/>
+      <w:r/>
+      <w:r/>
     </w:p>
     <w:p>
       <w:pPr>
@@ -36841,7 +36755,7 @@
         <w:ind w:firstLine="480"/>
       </w:pPr>
       <w:r>
-        <w:t>虽然本系统基本实现了收藏品商城的全部核心功能，但仍存在一定的局限性。第一，系统未实现商品搜索功能，用户只能通过分类筛选和分页浏览查找藏品，当藏品数量较多时查找效率较低。第二，系统目前未集成支付功能，订单提交后未对接真实支付渠道，交易流程需要线下完成。第三，系统缺少藏品评价功能，用户购买后无法对藏品进行评价，其他用户无法参考购买反馈。</w:t>
+        <w:t>虽然本系统基本实现了收藏品商城的全部核心功能，但仍存在一定的局限性。第一，系统的商品搜索功能较为基础，目前仅支持关键词模糊搜索，暂不支持价格区间、多条件组合等高级检索方式，当藏品数量较多时查找效率有待提升。第二，系统目前未集成支付功能，订单提交后未对接真实支付渠道，交易流程需要线下完成。第三，系统缺少藏品评价功能，用户购买后无法对藏品进行评价，其他用户无法参考购买反馈。</w:t>
       </w:r>
     </w:p>
     <w:p>

</xml_diff>